<commit_message>
feature: added a minimalistic cli, tweaked input template and event formatting
</commit_message>
<xml_diff>
--- a/packages/agenda-docx/input.docx
+++ b/packages/agenda-docx/input.docx
@@ -346,7 +346,19 @@
       </w:pPr>
       <w:r>
         <w:rPr/>
-        <w:t>{#custom}{#type-devenement}{type-devenement} - {/type-devenement}{/custom}</w:t>
+        <w:t>{#custom}{type</w:t>
+      </w:r>
+      <w:r>
+        <w:rPr/>
+        <w:t>s</w:t>
+      </w:r>
+      <w:r>
+        <w:rPr/>
+        <w:t>-devenement} - {/custom</w:t>
+      </w:r>
+      <w:r>
+        <w:rPr/>
+        <w:t>}</w:t>
       </w:r>
       <w:r>
         <w:rPr/>
@@ -360,17 +372,25 @@
       </w:pPr>
       <w:r>
         <w:rPr/>
-        <w:t>Horaires :</w:t>
-      </w:r>
-    </w:p>
-    <w:p>
-      <w:pPr>
-        <w:pStyle w:val="Normal"/>
-        <w:rPr/>
-      </w:pPr>
-      <w:r>
-        <w:rPr/>
-        <w:t>{#dates}Le {weekday} {day} {year}: {#timings}{beginHours}h{beginMinutes}-{endHours}h{endMinutes}  {/timings}{/dates}{#custom}{#conditions-de-participation}</w:t>
+        <w:t>Horaires :{#dates}</w:t>
+      </w:r>
+    </w:p>
+    <w:p>
+      <w:pPr>
+        <w:pStyle w:val="Normal"/>
+        <w:rPr/>
+      </w:pPr>
+      <w:r>
+        <w:rPr/>
+        <w:t>Le {weekday} {day} {year}: {#timings}{beginHours}h{beginMinutes}-{endHours}h{endMinutes}  {/timings</w:t>
+      </w:r>
+      <w:r>
+        <w:rPr/>
+        <w:t>}</w:t>
+      </w:r>
+      <w:r>
+        <w:rPr/>
+        <w:t>{/dates}{#custom}</w:t>
       </w:r>
     </w:p>
     <w:p>
@@ -390,7 +410,7 @@
       </w:pPr>
       <w:r>
         <w:rPr/>
-        <w:t>{conditions-de-participation}{/conditions-de-participation}{/custom}    {#registration}{value}    {/registration}</w:t>
+        <w:t>{conditions-de-participation}{/custom} {#registration} - {value}    {/registration}</w:t>
       </w:r>
     </w:p>
     <w:p>
@@ -420,11 +440,7 @@
       </w:pPr>
       <w:r>
         <w:rPr/>
-        <w:t>{/hasAccessibility}</w:t>
-      </w:r>
-      <w:r>
-        <w:rPr/>
-        <w:t>{canonicalUrl}</w:t>
+        <w:t>{/hasAccessibility}{canonicalUrl}</w:t>
       </w:r>
     </w:p>
     <w:p>
@@ -490,33 +506,17 @@
       </w:pPr>
       <w:r>
         <w:rPr/>
-        <w:t>{</w:t>
-      </w:r>
-      <w:r>
-        <w:rPr/>
-        <w:t>#</w:t>
-      </w:r>
-      <w:r>
-        <w:rPr/>
-        <w:t>description}</w:t>
-      </w:r>
-      <w:r>
-        <w:rPr/>
-        <w:t>{description}</w:t>
-      </w:r>
-    </w:p>
-    <w:p>
-      <w:pPr>
-        <w:pStyle w:val="Normal"/>
-        <w:rPr/>
-      </w:pPr>
-      <w:r>
-        <w:rPr/>
-        <w:t>{/description}</w:t>
-      </w:r>
-      <w:r>
-        <w:rPr/>
-        <w:t>{#tags}{label}   {/tags}{#phone}</w:t>
+        <w:t>{#description}{description}</w:t>
+      </w:r>
+    </w:p>
+    <w:p>
+      <w:pPr>
+        <w:pStyle w:val="Normal"/>
+        <w:rPr/>
+      </w:pPr>
+      <w:r>
+        <w:rPr/>
+        <w:t>{/description}{#tags}{label}   {/tags}{#phone}</w:t>
       </w:r>
     </w:p>
     <w:p>
@@ -632,7 +632,7 @@
       <w:fldChar w:fldCharType="separate"/>
     </w:r>
     <w:r>
-      <w:t>1</w:t>
+      <w:t>3</w:t>
     </w:r>
     <w:r>
       <w:fldChar w:fldCharType="end"/>

</xml_diff>

<commit_message>
agenda-docx: fix default template
</commit_message>
<xml_diff>
--- a/packages/agenda-docx/input.docx
+++ b/packages/agenda-docx/input.docx
@@ -1,6 +1,6 @@
 
 <file path=word/document.xml><?xml version="1.0" encoding="utf-8"?>
-<w:document xmlns:o="urn:schemas-microsoft-com:office:office" xmlns:r="http://schemas.openxmlformats.org/officeDocument/2006/relationships" xmlns:v="urn:schemas-microsoft-com:vml" xmlns:w="http://schemas.openxmlformats.org/wordprocessingml/2006/main" xmlns:w10="urn:schemas-microsoft-com:office:word" xmlns:wp="http://schemas.openxmlformats.org/drawingml/2006/wordprocessingDrawing">
+<w:document xmlns:o="urn:schemas-microsoft-com:office:office" xmlns:r="http://schemas.openxmlformats.org/officeDocument/2006/relationships" xmlns:v="urn:schemas-microsoft-com:vml" xmlns:w="http://schemas.openxmlformats.org/wordprocessingml/2006/main" xmlns:w10="urn:schemas-microsoft-com:office:word" xmlns:wp="http://schemas.openxmlformats.org/drawingml/2006/wordprocessingDrawing" xmlns:wps="http://schemas.microsoft.com/office/word/2010/wordprocessingShape" xmlns:wpg="http://schemas.microsoft.com/office/word/2010/wordprocessingGroup" xmlns:mc="http://schemas.openxmlformats.org/markup-compatibility/2006" xmlns:wp14="http://schemas.microsoft.com/office/word/2010/wordprocessingDrawing" xmlns:w14="http://schemas.microsoft.com/office/word/2010/wordml" mc:Ignorable="w14 wp14">
   <w:body>
     <w:p>
       <w:pPr>
@@ -23,7 +23,7 @@
     </w:p>
     <w:p>
       <w:pPr>
-        <w:pStyle w:val="Title"/>
+        <w:pStyle w:val="Titreprincipal"/>
         <w:rPr/>
       </w:pPr>
       <w:r>
@@ -33,7 +33,7 @@
     </w:p>
     <w:p>
       <w:pPr>
-        <w:pStyle w:val="Subtitle"/>
+        <w:pStyle w:val="Soustitre"/>
         <w:rPr/>
       </w:pPr>
       <w:r>
@@ -83,19 +83,17 @@
     </w:p>
     <w:p>
       <w:pPr>
-        <w:pStyle w:val="Contents1"/>
+        <w:pStyle w:val="Tabledesmatiresniveau1"/>
         <w:tabs>
           <w:tab w:val="right" w:pos="9638" w:leader="dot"/>
         </w:tabs>
-        <w:rPr>
-          <w:rStyle w:val="IndexLink"/>
-        </w:rPr>
+        <w:rPr/>
       </w:pPr>
       <w:r>
         <w:fldChar w:fldCharType="begin"/>
       </w:r>
       <w:r>
-        <w:instrText> TOC \f \o "1-3" \o "1-3" \h</w:instrText>
+        <w:instrText> TOC \f \o "1-3" \h</w:instrText>
       </w:r>
       <w:r>
         <w:fldChar w:fldCharType="separate"/>
@@ -103,55 +101,49 @@
       <w:hyperlink w:anchor="__RefHeading__3691_1520530195">
         <w:r>
           <w:rPr>
-            <w:rStyle w:val="IndexLink"/>
+            <w:rStyle w:val="Style"/>
           </w:rPr>
-          <w:t>{country} | {region}</w:t>
+          <w:t>{region}</w:t>
           <w:tab/>
-          <w:t>1</w:t>
+          <w:t>2</w:t>
         </w:r>
       </w:hyperlink>
     </w:p>
     <w:p>
       <w:pPr>
-        <w:pStyle w:val="Contents2"/>
+        <w:pStyle w:val="Tabledesmatiresniveau2"/>
         <w:tabs>
-          <w:tab w:val="right" w:pos="9355" w:leader="dot"/>
           <w:tab w:val="right" w:pos="9638" w:leader="dot"/>
         </w:tabs>
-        <w:rPr>
-          <w:rStyle w:val="IndexLink"/>
-        </w:rPr>
+        <w:rPr/>
       </w:pPr>
       <w:hyperlink w:anchor="__RefHeading__362_1082885894">
         <w:r>
           <w:rPr>
-            <w:rStyle w:val="IndexLink"/>
+            <w:rStyle w:val="Style"/>
           </w:rPr>
           <w:t>{department} | {city}</w:t>
           <w:tab/>
-          <w:t>1</w:t>
+          <w:t>2</w:t>
         </w:r>
       </w:hyperlink>
     </w:p>
     <w:p>
       <w:pPr>
-        <w:pStyle w:val="Contents3"/>
+        <w:pStyle w:val="Tabledesmatiresniveau3"/>
         <w:tabs>
-          <w:tab w:val="right" w:pos="9072" w:leader="dot"/>
           <w:tab w:val="right" w:pos="9638" w:leader="dot"/>
         </w:tabs>
-        <w:rPr>
-          <w:rStyle w:val="IndexLink"/>
-        </w:rPr>
+        <w:rPr/>
       </w:pPr>
       <w:hyperlink w:anchor="__RefHeading__364_1082885894">
         <w:r>
           <w:rPr>
-            <w:rStyle w:val="IndexLink"/>
+            <w:rStyle w:val="Style"/>
           </w:rPr>
           <w:t>{location}</w:t>
           <w:tab/>
-          <w:t>1</w:t>
+          <w:t>2</w:t>
         </w:r>
       </w:hyperlink>
       <w:r>
@@ -175,11 +167,13 @@
       <w:r>
         <w:rPr/>
       </w:r>
-    </w:p>
-    <w:p>
-      <w:pPr>
-        <w:pStyle w:val="Normal"/>
-        <w:pageBreakBefore/>
+      <w:r>
+        <w:br w:type="page"/>
+      </w:r>
+    </w:p>
+    <w:p>
+      <w:pPr>
+        <w:pStyle w:val="Normal"/>
         <w:rPr/>
       </w:pPr>
       <w:r>
@@ -189,18 +183,24 @@
     </w:p>
     <w:p>
       <w:pPr>
-        <w:pStyle w:val="Heading1"/>
+        <w:pStyle w:val="Titre1"/>
         <w:numPr>
           <w:ilvl w:val="0"/>
           <w:numId w:val="1"/>
         </w:numPr>
-        <w:rPr/>
+        <w:rPr>
+          <w:sz w:val="40"/>
+          <w:szCs w:val="40"/>
+        </w:rPr>
       </w:pPr>
       <w:bookmarkStart w:id="0" w:name="__RefHeading__3691_1520530195"/>
       <w:bookmarkEnd w:id="0"/>
       <w:r>
-        <w:rPr/>
-        <w:t>{country} | {region}</w:t>
+        <w:rPr>
+          <w:sz w:val="40"/>
+          <w:szCs w:val="40"/>
+        </w:rPr>
+        <w:t>{region}</w:t>
       </w:r>
     </w:p>
     <w:p>
@@ -219,7 +219,7 @@
     </w:p>
     <w:p>
       <w:pPr>
-        <w:pStyle w:val="Heading2"/>
+        <w:pStyle w:val="Titre2"/>
         <w:numPr>
           <w:ilvl w:val="1"/>
           <w:numId w:val="1"/>
@@ -263,7 +263,7 @@
     </w:p>
     <w:p>
       <w:pPr>
-        <w:pStyle w:val="Heading3"/>
+        <w:pStyle w:val="Titre3"/>
         <w:numPr>
           <w:ilvl w:val="2"/>
           <w:numId w:val="1"/>
@@ -291,33 +291,17 @@
     <w:p>
       <w:pPr>
         <w:pStyle w:val="Normal"/>
-        <w:rPr/>
-      </w:pPr>
-      <w:r>
-        <w:rPr/>
-      </w:r>
-    </w:p>
-    <w:p>
-      <w:pPr>
-        <w:pStyle w:val="Normal"/>
-        <w:rPr/>
-      </w:pPr>
-      <w:r>
-        <w:rPr/>
-      </w:r>
-    </w:p>
-    <w:p>
-      <w:pPr>
-        <w:pStyle w:val="Normal"/>
-        <w:rPr/>
-      </w:pPr>
-      <w:r>
-        <w:rPr/>
-      </w:r>
-    </w:p>
-    <w:p>
-      <w:pPr>
-        <w:pStyle w:val="Normal"/>
+        <w:jc w:val="left"/>
+        <w:rPr/>
+      </w:pPr>
+      <w:r>
+        <w:rPr/>
+      </w:r>
+    </w:p>
+    <w:p>
+      <w:pPr>
+        <w:pStyle w:val="Normal"/>
+        <w:jc w:val="left"/>
         <w:rPr/>
       </w:pPr>
       <w:r>
@@ -327,7 +311,7 @@
     </w:p>
     <w:p>
       <w:pPr>
-        <w:pStyle w:val="Heading4"/>
+        <w:pStyle w:val="Titre4"/>
         <w:numPr>
           <w:ilvl w:val="3"/>
           <w:numId w:val="1"/>
@@ -346,23 +330,41 @@
       </w:pPr>
       <w:r>
         <w:rPr/>
-        <w:t>{#custom}{</w:t>
-      </w:r>
-      <w:r>
-        <w:rPr/>
-        <w:t>#</w:t>
-      </w:r>
-      <w:r>
-        <w:rPr/>
-        <w:t>types-devenement}</w:t>
-      </w:r>
-      <w:r>
-        <w:rPr/>
-        <w:t>{types-devenement} - {/types-devenement}{#edition-2018}{edition-2018} - {/edition-2018}</w:t>
-      </w:r>
-      <w:r>
-        <w:rPr/>
-        <w:t>{/custom}{description}</w:t>
+        <w:t>{#custom</w:t>
+      </w:r>
+      <w:r>
+        <w:rPr/>
+        <w:t>[ ’types-devenement’ ]</w:t>
+      </w:r>
+      <w:r>
+        <w:rPr/>
+        <w:t>}{custom</w:t>
+      </w:r>
+      <w:r>
+        <w:rPr/>
+        <w:t>[ ’types-devenement’ ]</w:t>
+      </w:r>
+      <w:r>
+        <w:rPr/>
+        <w:t>} - {/custom</w:t>
+      </w:r>
+      <w:r>
+        <w:rPr/>
+        <w:t>[ ’types-devenement’ ]</w:t>
+      </w:r>
+      <w:r>
+        <w:rPr/>
+        <w:t>}{#custom[ ’edition-2018’ ]}{</w:t>
+      </w:r>
+      <w:bookmarkStart w:id="3" w:name="__DdeLink__4560_1695642445"/>
+      <w:r>
+        <w:rPr/>
+        <w:t>custom[ ’edition-2018’ ]</w:t>
+      </w:r>
+      <w:bookmarkEnd w:id="3"/>
+      <w:r>
+        <w:rPr/>
+        <w:t>} - {/custom[ ’edition-2018’ ]}{description}</w:t>
       </w:r>
     </w:p>
     <w:p>
@@ -377,12 +379,14 @@
     </w:p>
     <w:p>
       <w:pPr>
-        <w:pStyle w:val="Normal"/>
-        <w:rPr/>
-      </w:pPr>
-      <w:r>
-        <w:rPr/>
-        <w:t>Le {weekday} {day} {year}: {#timings}{beginHours}h{beginMinutes}-{endHours}h{endMinutes}  {/timings}{/dates}{#custom}</w:t>
+        <w:pStyle w:val="Corpsdetexte"/>
+        <w:spacing w:before="0" w:after="142"/>
+        <w:contextualSpacing/>
+        <w:rPr/>
+      </w:pPr>
+      <w:r>
+        <w:rPr/>
+        <w:t>Le {weekday} {day} {year}: {#timings}{beginHours}h{beginMinutes}-{endHours}h{endMinutes} {#1 &lt; 0}         {/}{/timings}{/dates}{#custom}{#conditions-de-participation || (registration &amp;&amp; registration.length) || conditions}</w:t>
       </w:r>
     </w:p>
     <w:p>
@@ -394,29 +398,75 @@
         <w:rPr/>
         <w:t>Conditions et réservation :</w:t>
       </w:r>
-    </w:p>
-    <w:p>
-      <w:pPr>
-        <w:pStyle w:val="Normal"/>
-        <w:rPr/>
-      </w:pPr>
-      <w:r>
-        <w:rPr/>
-        <w:t>{conditions-de-participation}{/custom} {#registration} - {value}    {/registration}</w:t>
-      </w:r>
-      <w:r>
-        <w:rPr/>
-        <w:t>{#conditions}</w:t>
-      </w:r>
-    </w:p>
-    <w:p>
-      <w:pPr>
-        <w:pStyle w:val="Normal"/>
-        <w:rPr/>
-      </w:pPr>
-      <w:r>
-        <w:rPr/>
-        <w:t>Détail : {conditions}{/conditions}</w:t>
+      <w:r>
+        <w:rPr/>
+        <w:t>{/}{#conditions-de-participation}</w:t>
+      </w:r>
+    </w:p>
+    <w:p>
+      <w:pPr>
+        <w:pStyle w:val="Normal"/>
+        <w:rPr/>
+      </w:pPr>
+      <w:r>
+        <w:rPr/>
+        <w:t>{conditions-de-participation} {/conditions-de-participation}</w:t>
+      </w:r>
+      <w:r>
+        <w:rPr/>
+        <w:t>{/custom</w:t>
+      </w:r>
+      <w:r>
+        <w:rPr/>
+        <w:t>}{#registration.length}</w:t>
+      </w:r>
+    </w:p>
+    <w:p>
+      <w:pPr>
+        <w:pStyle w:val="TextBody"/>
+        <w:rPr/>
+      </w:pPr>
+      <w:r>
+        <w:rPr/>
+        <w:t>{/registration.length}</w:t>
+      </w:r>
+      <w:r>
+        <w:rPr/>
+        <w:t>{#registration}</w:t>
+      </w:r>
+      <w:r>
+        <w:rPr/>
+        <w:t>{#$index &gt; 0}</w:t>
+      </w:r>
+      <w:r>
+        <w:rPr/>
+        <w:t xml:space="preserve"> - </w:t>
+      </w:r>
+      <w:r>
+        <w:rPr/>
+        <w:t>{/}</w:t>
+      </w:r>
+      <w:r>
+        <w:rPr/>
+        <w:t>{value}    {/registration}{#conditions}</w:t>
+      </w:r>
+    </w:p>
+    <w:p>
+      <w:pPr>
+        <w:pStyle w:val="TextBody"/>
+        <w:rPr/>
+      </w:pPr>
+      <w:r>
+        <w:rPr/>
+        <w:t>Détail</w:t>
+      </w:r>
+      <w:r>
+        <w:rPr/>
+        <w:t>s</w:t>
+      </w:r>
+      <w:r>
+        <w:rPr/>
+        <w:t> : {conditions}{/conditions}{#hasAccessibility}</w:t>
       </w:r>
     </w:p>
     <w:p>
@@ -426,36 +476,37 @@
       </w:pPr>
       <w:r>
         <w:rPr/>
-        <w:t>{#hasAccessibility}Accessibilité :</w:t>
-      </w:r>
-    </w:p>
-    <w:p>
-      <w:pPr>
-        <w:pStyle w:val="Normal"/>
-        <w:rPr/>
-      </w:pPr>
-      <w:r>
-        <w:rPr/>
-        <w:t>{#accessibility}{label}   {/accessibility}</w:t>
-      </w:r>
-    </w:p>
-    <w:p>
-      <w:pPr>
-        <w:pStyle w:val="TextBodySub"/>
-        <w:rPr/>
-      </w:pPr>
-      <w:r>
-        <w:rPr/>
-        <w:t>{/hasAccessibility}{canonicalUrl}</w:t>
-      </w:r>
-    </w:p>
-    <w:p>
-      <w:pPr>
-        <w:pStyle w:val="TextBodySub"/>
-        <w:rPr/>
-      </w:pPr>
-      <w:r>
-        <w:rPr/>
+        <w:t>Accessibilité :</w:t>
+      </w:r>
+    </w:p>
+    <w:p>
+      <w:pPr>
+        <w:pStyle w:val="Normal"/>
+        <w:rPr/>
+      </w:pPr>
+      <w:r>
+        <w:rPr/>
+        <w:t>{#accessibility}{label}  {/accessibility}</w:t>
+      </w:r>
+    </w:p>
+    <w:p>
+      <w:pPr>
+        <w:pStyle w:val="TextBody"/>
+        <w:rPr/>
+      </w:pPr>
+      <w:r>
+        <w:rPr/>
+        <w:t>{/hasAccessibility}</w:t>
+      </w:r>
+    </w:p>
+    <w:p>
+      <w:pPr>
+        <w:pStyle w:val="TextBody"/>
+        <w:rPr/>
+      </w:pPr>
+      <w:r>
+        <w:rPr/>
+        <w:t>{canonicalUrl}</w:t>
       </w:r>
     </w:p>
     <w:p>
@@ -479,29 +530,17 @@
     </w:p>
     <w:p>
       <w:pPr>
-        <w:pStyle w:val="Normal"/>
-        <w:rPr/>
-      </w:pPr>
-      <w:r>
-        <w:rPr/>
-      </w:r>
-    </w:p>
-    <w:p>
-      <w:pPr>
-        <w:pStyle w:val="Normal"/>
-        <w:rPr/>
-      </w:pPr>
-      <w:r>
-        <w:rPr/>
-      </w:r>
-    </w:p>
-    <w:p>
-      <w:pPr>
         <w:pStyle w:val="TextBodyTitle"/>
-        <w:rPr/>
-      </w:pPr>
-      <w:r>
-        <w:rPr/>
+        <w:rPr>
+          <w:sz w:val="24"/>
+          <w:szCs w:val="24"/>
+        </w:rPr>
+      </w:pPr>
+      <w:r>
+        <w:rPr>
+          <w:sz w:val="24"/>
+          <w:szCs w:val="24"/>
+        </w:rPr>
         <w:t>Plus d'information sur le lieu :</w:t>
       </w:r>
     </w:p>
@@ -553,55 +592,27 @@
       <w:r>
         <w:rPr/>
       </w:r>
-    </w:p>
-    <w:p>
-      <w:pPr>
-        <w:pStyle w:val="Normal"/>
-        <w:pageBreakBefore/>
-        <w:rPr/>
-      </w:pPr>
-      <w:r>
-        <w:rPr/>
-      </w:r>
-    </w:p>
-    <w:p>
-      <w:pPr>
-        <w:pStyle w:val="Normal"/>
-        <w:rPr/>
-      </w:pPr>
-      <w:r>
-        <w:rPr/>
-        <w:t>{/locations}</w:t>
-      </w:r>
-    </w:p>
-    <w:p>
-      <w:pPr>
-        <w:pStyle w:val="Normal"/>
-        <w:rPr/>
-      </w:pPr>
-      <w:r>
-        <w:rPr/>
-        <w:t>{/cities}</w:t>
-      </w:r>
-    </w:p>
-    <w:p>
-      <w:pPr>
-        <w:pStyle w:val="Normal"/>
-        <w:rPr/>
-      </w:pPr>
-      <w:r>
-        <w:rPr/>
-        <w:t>{/departments}</w:t>
-      </w:r>
-    </w:p>
-    <w:p>
-      <w:pPr>
-        <w:pStyle w:val="Normal"/>
-        <w:rPr/>
-      </w:pPr>
-      <w:r>
-        <w:rPr/>
-        <w:t>{/regions}</w:t>
+      <w:r>
+        <w:br w:type="page"/>
+      </w:r>
+    </w:p>
+    <w:p>
+      <w:pPr>
+        <w:pStyle w:val="Normal"/>
+        <w:rPr/>
+      </w:pPr>
+      <w:r>
+        <w:rPr/>
+      </w:r>
+    </w:p>
+    <w:p>
+      <w:pPr>
+        <w:pStyle w:val="Normal"/>
+        <w:rPr/>
+      </w:pPr>
+      <w:r>
+        <w:rPr/>
+        <w:t>{/locations}{/cities}{/departments}{/regions}</w:t>
       </w:r>
     </w:p>
     <w:sectPr>
@@ -620,10 +631,10 @@
 </file>
 
 <file path=word/footer1.xml><?xml version="1.0" encoding="utf-8"?>
-<w:ftr xmlns:o="urn:schemas-microsoft-com:office:office" xmlns:r="http://schemas.openxmlformats.org/officeDocument/2006/relationships" xmlns:v="urn:schemas-microsoft-com:vml" xmlns:w="http://schemas.openxmlformats.org/wordprocessingml/2006/main" xmlns:w10="urn:schemas-microsoft-com:office:word" xmlns:wp="http://schemas.openxmlformats.org/drawingml/2006/wordprocessingDrawing">
+<w:ftr xmlns:o="urn:schemas-microsoft-com:office:office" xmlns:r="http://schemas.openxmlformats.org/officeDocument/2006/relationships" xmlns:v="urn:schemas-microsoft-com:vml" xmlns:w="http://schemas.openxmlformats.org/wordprocessingml/2006/main" xmlns:w10="urn:schemas-microsoft-com:office:word" xmlns:wp="http://schemas.openxmlformats.org/drawingml/2006/wordprocessingDrawing" xmlns:wps="http://schemas.microsoft.com/office/word/2010/wordprocessingShape" xmlns:wpg="http://schemas.microsoft.com/office/word/2010/wordprocessingGroup" xmlns:mc="http://schemas.openxmlformats.org/markup-compatibility/2006" xmlns:wp14="http://schemas.microsoft.com/office/word/2010/wordprocessingDrawing" xmlns:w14="http://schemas.microsoft.com/office/word/2010/wordml" mc:Ignorable="w14 wp14">
   <w:p>
     <w:pPr>
-      <w:pStyle w:val="Footer"/>
+      <w:pStyle w:val="Pieddepage"/>
       <w:jc w:val="right"/>
       <w:rPr/>
     </w:pPr>
@@ -668,10 +679,10 @@
 </file>
 
 <file path=word/header1.xml><?xml version="1.0" encoding="utf-8"?>
-<w:hdr xmlns:o="urn:schemas-microsoft-com:office:office" xmlns:r="http://schemas.openxmlformats.org/officeDocument/2006/relationships" xmlns:v="urn:schemas-microsoft-com:vml" xmlns:w="http://schemas.openxmlformats.org/wordprocessingml/2006/main" xmlns:w10="urn:schemas-microsoft-com:office:word" xmlns:wp="http://schemas.openxmlformats.org/drawingml/2006/wordprocessingDrawing">
+<w:hdr xmlns:o="urn:schemas-microsoft-com:office:office" xmlns:r="http://schemas.openxmlformats.org/officeDocument/2006/relationships" xmlns:v="urn:schemas-microsoft-com:vml" xmlns:w="http://schemas.openxmlformats.org/wordprocessingml/2006/main" xmlns:w10="urn:schemas-microsoft-com:office:word" xmlns:wp="http://schemas.openxmlformats.org/drawingml/2006/wordprocessingDrawing" xmlns:wps="http://schemas.microsoft.com/office/word/2010/wordprocessingShape" xmlns:wpg="http://schemas.microsoft.com/office/word/2010/wordprocessingGroup" xmlns:mc="http://schemas.openxmlformats.org/markup-compatibility/2006" xmlns:wp14="http://schemas.microsoft.com/office/word/2010/wordprocessingDrawing" xmlns:w14="http://schemas.microsoft.com/office/word/2010/wordml" mc:Ignorable="w14 wp14">
   <w:p>
     <w:pPr>
-      <w:pStyle w:val="Header"/>
+      <w:pStyle w:val="Entte"/>
       <w:jc w:val="center"/>
       <w:rPr/>
     </w:pPr>
@@ -906,7 +917,7 @@
 </file>
 
 <file path=word/styles.xml><?xml version="1.0" encoding="utf-8"?>
-<w:styles xmlns:w="http://schemas.openxmlformats.org/wordprocessingml/2006/main">
+<w:styles xmlns:w="http://schemas.openxmlformats.org/wordprocessingml/2006/main" xmlns:w14="http://schemas.microsoft.com/office/word/2010/wordml" xmlns:mc="http://schemas.openxmlformats.org/markup-compatibility/2006" mc:Ignorable="w14">
   <w:docDefaults>
     <w:rPrDefault>
       <w:rPr>
@@ -922,7 +933,9 @@
   </w:docDefaults>
   <w:style w:type="paragraph" w:styleId="Normal">
     <w:name w:val="Normal"/>
-    <w:pPr>
+    <w:qFormat/>
+    <w:pPr>
+      <w:keepNext/>
       <w:widowControl w:val="false"/>
       <w:suppressAutoHyphens w:val="true"/>
       <w:bidi w:val="0"/>
@@ -936,9 +949,10 @@
       <w:lang w:val="fr-FR" w:eastAsia="zh-CN" w:bidi="hi-IN"/>
     </w:rPr>
   </w:style>
-  <w:style w:type="paragraph" w:styleId="Heading1">
+  <w:style w:type="paragraph" w:styleId="Titre1">
     <w:name w:val="Heading 1"/>
-    <w:basedOn w:val="Heading"/>
+    <w:basedOn w:val="Titre"/>
+    <w:qFormat/>
     <w:pPr>
       <w:spacing w:before="240" w:after="120"/>
       <w:outlineLvl w:val="0"/>
@@ -951,9 +965,10 @@
       <w:szCs w:val="36"/>
     </w:rPr>
   </w:style>
-  <w:style w:type="paragraph" w:styleId="Heading2">
+  <w:style w:type="paragraph" w:styleId="Titre2">
     <w:name w:val="Heading 2"/>
-    <w:basedOn w:val="Heading"/>
+    <w:basedOn w:val="Titre"/>
+    <w:qFormat/>
     <w:pPr>
       <w:spacing w:before="200" w:after="120"/>
       <w:outlineLvl w:val="1"/>
@@ -966,9 +981,10 @@
       <w:szCs w:val="32"/>
     </w:rPr>
   </w:style>
-  <w:style w:type="paragraph" w:styleId="Heading3">
+  <w:style w:type="paragraph" w:styleId="Titre3">
     <w:name w:val="Heading 3"/>
-    <w:basedOn w:val="Heading"/>
+    <w:basedOn w:val="Titre"/>
+    <w:qFormat/>
     <w:pPr>
       <w:spacing w:before="140" w:after="120"/>
       <w:jc w:val="center"/>
@@ -982,9 +998,10 @@
       <w:szCs w:val="28"/>
     </w:rPr>
   </w:style>
-  <w:style w:type="paragraph" w:styleId="Heading4">
+  <w:style w:type="paragraph" w:styleId="Titre4">
     <w:name w:val="Heading 4"/>
-    <w:basedOn w:val="Heading"/>
+    <w:basedOn w:val="Titre"/>
+    <w:qFormat/>
     <w:pPr>
       <w:spacing w:before="120" w:after="120"/>
       <w:outlineLvl w:val="3"/>
@@ -1002,20 +1019,31 @@
   </w:style>
   <w:style w:type="character" w:styleId="InternetLink">
     <w:name w:val="Internet Link"/>
+    <w:qFormat/>
     <w:rPr>
       <w:color w:val="000080"/>
       <w:u w:val="single"/>
       <w:lang w:val="zxx" w:eastAsia="zxx" w:bidi="zxx"/>
     </w:rPr>
   </w:style>
-  <w:style w:type="character" w:styleId="IndexLink">
-    <w:name w:val="Index Link"/>
+  <w:style w:type="character" w:styleId="Sautdindex">
+    <w:name w:val="Saut d'index"/>
+    <w:qFormat/>
     <w:rPr/>
   </w:style>
-  <w:style w:type="paragraph" w:styleId="Heading">
-    <w:name w:val="Heading"/>
+  <w:style w:type="character" w:styleId="LienInternet">
+    <w:name w:val="Lien Internet"/>
+    <w:rPr>
+      <w:color w:val="000080"/>
+      <w:u w:val="single"/>
+      <w:lang w:val="zxx" w:eastAsia="zxx" w:bidi="zxx"/>
+    </w:rPr>
+  </w:style>
+  <w:style w:type="paragraph" w:styleId="Titre">
+    <w:name w:val="Titre"/>
     <w:basedOn w:val="Normal"/>
-    <w:next w:val="TextBody"/>
+    <w:next w:val="Corpsdetexte"/>
+    <w:qFormat/>
     <w:pPr>
       <w:keepNext/>
       <w:spacing w:before="240" w:after="120"/>
@@ -1026,25 +1054,34 @@
       <w:szCs w:val="28"/>
     </w:rPr>
   </w:style>
-  <w:style w:type="paragraph" w:styleId="TextBody">
-    <w:name w:val="Text Body"/>
+  <w:style w:type="paragraph" w:styleId="Corpsdetexte">
+    <w:name w:val="Body Text"/>
     <w:basedOn w:val="Normal"/>
     <w:pPr>
       <w:spacing w:lineRule="auto" w:line="288" w:before="0" w:after="140"/>
     </w:pPr>
     <w:rPr/>
   </w:style>
-  <w:style w:type="paragraph" w:styleId="List">
+  <w:style w:type="paragraph" w:styleId="Liste">
     <w:name w:val="List"/>
-    <w:basedOn w:val="TextBody"/>
-    <w:pPr/>
-    <w:rPr>
-      <w:rFonts w:cs="Lohit Marathi"/>
-    </w:rPr>
-  </w:style>
-  <w:style w:type="paragraph" w:styleId="Caption">
+    <w:basedOn w:val="Corpsdetexte"/>
+    <w:pPr>
+      <w:widowControl w:val="false"/>
+      <w:bidi w:val="0"/>
+      <w:jc w:val="left"/>
+    </w:pPr>
+    <w:rPr>
+      <w:rFonts w:ascii="Liberation Serif" w:hAnsi="Liberation Serif" w:eastAsia="Droid Sans Fallback" w:cs="Lohit Marathi"/>
+      <w:color w:val="00000A"/>
+      <w:sz w:val="24"/>
+      <w:szCs w:val="24"/>
+      <w:lang w:val="fr-FR" w:eastAsia="zh-CN" w:bidi="hi-IN"/>
+    </w:rPr>
+  </w:style>
+  <w:style w:type="paragraph" w:styleId="Lgende">
     <w:name w:val="Caption"/>
     <w:basedOn w:val="Normal"/>
+    <w:qFormat/>
     <w:pPr>
       <w:suppressLineNumbers/>
       <w:spacing w:before="120" w:after="120"/>
@@ -1060,25 +1097,38 @@
   <w:style w:type="paragraph" w:styleId="Index">
     <w:name w:val="Index"/>
     <w:basedOn w:val="Normal"/>
+    <w:qFormat/>
     <w:pPr>
       <w:suppressLineNumbers/>
     </w:pPr>
     <w:rPr>
       <w:rFonts w:cs="Lohit Marathi"/>
     </w:rPr>
+  </w:style>
+  <w:style w:type="paragraph" w:styleId="TextBody">
+    <w:name w:val="Text Body"/>
+    <w:basedOn w:val="Normal"/>
+    <w:qFormat/>
+    <w:pPr>
+      <w:keepNext/>
+      <w:spacing w:lineRule="auto" w:line="288" w:before="0" w:after="140"/>
+    </w:pPr>
+    <w:rPr/>
   </w:style>
   <w:style w:type="paragraph" w:styleId="Quotations">
     <w:name w:val="Quotations"/>
     <w:basedOn w:val="Normal"/>
+    <w:qFormat/>
     <w:pPr>
       <w:spacing w:before="0" w:after="283"/>
       <w:ind w:left="567" w:right="567" w:hanging="0"/>
     </w:pPr>
     <w:rPr/>
   </w:style>
-  <w:style w:type="paragraph" w:styleId="Title">
+  <w:style w:type="paragraph" w:styleId="Titreprincipal">
     <w:name w:val="Title"/>
-    <w:basedOn w:val="Heading"/>
+    <w:basedOn w:val="Titre"/>
+    <w:qFormat/>
     <w:pPr>
       <w:spacing w:before="403" w:after="374"/>
       <w:jc w:val="center"/>
@@ -1091,9 +1141,10 @@
       <w:szCs w:val="56"/>
     </w:rPr>
   </w:style>
-  <w:style w:type="paragraph" w:styleId="Subtitle">
+  <w:style w:type="paragraph" w:styleId="Soustitre">
     <w:name w:val="Subtitle"/>
-    <w:basedOn w:val="Heading"/>
+    <w:basedOn w:val="Titre"/>
+    <w:qFormat/>
     <w:pPr>
       <w:spacing w:before="60" w:after="120"/>
       <w:jc w:val="center"/>
@@ -1106,7 +1157,8 @@
   </w:style>
   <w:style w:type="paragraph" w:styleId="ContentsHeading">
     <w:name w:val="Contents Heading"/>
-    <w:basedOn w:val="Heading"/>
+    <w:basedOn w:val="Titre"/>
+    <w:qFormat/>
     <w:pPr>
       <w:suppressLineNumbers/>
       <w:ind w:left="0" w:right="0" w:hanging="0"/>
@@ -1121,6 +1173,7 @@
   <w:style w:type="paragraph" w:styleId="Contents1">
     <w:name w:val="Contents 1"/>
     <w:basedOn w:val="Index"/>
+    <w:qFormat/>
     <w:pPr>
       <w:tabs>
         <w:tab w:val="right" w:pos="9638" w:leader="dot"/>
@@ -1132,6 +1185,7 @@
   <w:style w:type="paragraph" w:styleId="Contents2">
     <w:name w:val="Contents 2"/>
     <w:basedOn w:val="Index"/>
+    <w:qFormat/>
     <w:pPr>
       <w:tabs>
         <w:tab w:val="right" w:pos="9355" w:leader="dot"/>
@@ -1143,6 +1197,7 @@
   <w:style w:type="paragraph" w:styleId="Contents3">
     <w:name w:val="Contents 3"/>
     <w:basedOn w:val="Index"/>
+    <w:qFormat/>
     <w:pPr>
       <w:tabs>
         <w:tab w:val="right" w:pos="9072" w:leader="dot"/>
@@ -1154,6 +1209,7 @@
   <w:style w:type="paragraph" w:styleId="TextBodyTitle">
     <w:name w:val="Text Body Title"/>
     <w:basedOn w:val="TextBody"/>
+    <w:qFormat/>
     <w:pPr>
       <w:spacing w:before="144" w:after="0"/>
     </w:pPr>
@@ -1161,13 +1217,13 @@
       <w:b/>
     </w:rPr>
   </w:style>
-  <w:style w:type="paragraph" w:styleId="Header">
+  <w:style w:type="paragraph" w:styleId="Entte">
     <w:name w:val="Header"/>
     <w:basedOn w:val="Normal"/>
     <w:pPr/>
     <w:rPr/>
   </w:style>
-  <w:style w:type="paragraph" w:styleId="Footer">
+  <w:style w:type="paragraph" w:styleId="Pieddepage">
     <w:name w:val="Footer"/>
     <w:basedOn w:val="Normal"/>
     <w:pPr/>
@@ -1176,12 +1232,56 @@
   <w:style w:type="paragraph" w:styleId="TextBodySub">
     <w:name w:val="Text Body Sub"/>
     <w:basedOn w:val="Normal"/>
+    <w:qFormat/>
     <w:pPr>
       <w:spacing w:before="115" w:after="58"/>
     </w:pPr>
     <w:rPr>
       <w:sz w:val="18"/>
     </w:rPr>
+  </w:style>
+  <w:style w:type="paragraph" w:styleId="Texteprformat">
+    <w:name w:val="Texte préformaté"/>
+    <w:basedOn w:val="Normal"/>
+    <w:qFormat/>
+    <w:pPr/>
+    <w:rPr/>
+  </w:style>
+  <w:style w:type="paragraph" w:styleId="Timingsblock">
+    <w:name w:val="Timings block"/>
+    <w:qFormat/>
+    <w:pPr>
+      <w:widowControl w:val="false"/>
+    </w:pPr>
+    <w:rPr>
+      <w:rFonts w:ascii="Liberation Serif" w:hAnsi="Liberation Serif" w:eastAsia="Droid Sans Fallback" w:cs="Lohit Marathi"/>
+      <w:color w:val="auto"/>
+      <w:sz w:val="24"/>
+      <w:szCs w:val="24"/>
+      <w:lang w:val="fr-FR" w:eastAsia="zh-CN" w:bidi="hi-IN"/>
+    </w:rPr>
+  </w:style>
+  <w:style w:type="paragraph" w:styleId="Tabledesmatiresniveau1">
+    <w:name w:val="TOC 1"/>
+    <w:basedOn w:val="Index"/>
+    <w:pPr/>
+    <w:rPr/>
+  </w:style>
+  <w:style w:type="paragraph" w:styleId="Tabledesmatiresniveau2">
+    <w:name w:val="TOC 2"/>
+    <w:basedOn w:val="Index"/>
+    <w:pPr>
+      <w:ind w:left="283" w:right="0" w:hanging="0"/>
+    </w:pPr>
+    <w:rPr/>
+  </w:style>
+  <w:style w:type="paragraph" w:styleId="Tabledesmatiresniveau3">
+    <w:name w:val="TOC 3"/>
+    <w:basedOn w:val="Index"/>
+    <w:pPr>
+      <w:ind w:left="567" w:right="0" w:hanging="0"/>
+    </w:pPr>
+    <w:rPr/>
   </w:style>
 </w:styles>
 </file>
</xml_diff>